<commit_message>
fix: adjust ui texts, calendar icon, and modal layout
</commit_message>
<xml_diff>
--- a/report.docx
+++ b/report.docx
@@ -243,7 +243,7 @@
           <w:i w:val="0"/>
           <w:sz w:val="24"/>
         </w:rPr>
-        <w:t>Данный проект представляет собой современное, отзывчивое SPA веб-приложение в стиле Kanban-доски. Интерфейс спроектирован с использованием премиального стиля Glassmorphism и темной темы. Приложение позволяет пользователям создавать персональные доски проектов, добавлять колонки состояний (например: «В планах», «В работе», «Готово») и управлять карточками задач. Реализована полноценная поддержка drag-and-drop для перемещения задач между колонками, настройка приоритета и срока выполнения, а также секция обсуждения в виде комментариев.</w:t>
+        <w:t>Данный проект — это веб-приложение для управления задачами (канбан-доска). Интерфейс оформлен в темной теме с эффектом матового стекла (Glassmorphism). Приложение позволяет пользователям создавать персональные доски проектов, добавлять колонки состояний (например: «В планах», «В работе», «Готово») и управлять карточками задач. Реализована поддержка drag-and-drop для перемещения задач между колонками, настройка приоритета и срока выполнения, а также комментарии к задачам.</w:t>
       </w:r>
     </w:p>
     <w:p>
@@ -1023,7 +1023,7 @@
           <w:i w:val="0"/>
           <w:sz w:val="24"/>
         </w:rPr>
-        <w:t>В процессе прохождения производственной практики была полностью выполнена поставленная задача по проектированию и разработке полнофункционального веб-приложения для визуального управления проектами и задачами «Glass Kanban». В качестве основы была выбрана идея создания клона Trello из каталога пет-проектов.</w:t>
+        <w:t>В процессе прохождения производственной практики была выполнена задача по проектированию и разработке веб-приложения для управления задачами «Glass Kanban». В качестве основы была выбрана идея создания клона Trello из каталога пет-проектов.</w:t>
       </w:r>
     </w:p>
     <w:p>
@@ -1044,9 +1044,9 @@
         <w:br/>
         <w:t>2. Реализация защищенной системы авторизации на бэкенде. Для исключения уязвимостей CSRF и XSS аутентификационный JWT-токен сохраняется на стороне сервера в защищенной HTTP-only куке с флагами SameSite=Strict и Secure. Это гарантирует надежность передачи токенов без возможности их считывания через клиентский JavaScript.</w:t>
         <w:br/>
-        <w:t>3. Разработка интерактивного интерфейса. Интерфейс выполнен в единой стилистике Glassmorphism. Матовые полупрозрачные блоки с размытием заднего фона и аккуратные неоновые границы создают премиальный визуальный эффект и делают работу с интерфейсом приятной.</w:t>
+        <w:t>3. Разработка интерфейса. Интерфейс стилизован под Glassmorphism (эффект матового стекла), реализована темная тема. Матовые полупрозрачные блоки выглядят современно и не перегружают экран.</w:t>
         <w:br/>
-        <w:t>4. Интеграция Drag-and-Drop. Для снижения объема кода и повышения его поддерживаемости было решено использовать встроенный в браузер HTML5 Drag and Drop API. Были настроены обработчики перетаскивания и внедрена технология Optimistic UI (оптимистичное обновление интерфейса), которая моментально сдвигает карточку на экране при отпускании, а затем в фоновом режиме сохраняет новое состояние в БД. Это обеспечивает полное отсутствие задержек в работе интерфейса.</w:t>
+        <w:t>4. Интеграция Drag-and-Drop. Чтобы не перегружать проект тяжелыми библиотеками, перетаскивание реализовано на чистом HTML5 Drag and Drop API. Настроены обработчики перетаскивания и моментальное визуальное обновление интерфейса, которое сразу сдвигает карточку на экране, а затем сохраняет новое состояние в базу данных.</w:t>
       </w:r>
     </w:p>
     <w:p>
@@ -1063,9 +1063,9 @@
         </w:rPr>
         <w:t>Среди основных трудностей, возникших при реализации проекта, можно выделить:</w:t>
         <w:br/>
-        <w:t>• Обеспечение корректного поведения middleware при проверке авторизации на пограничном Edge-сервере Next.js. Поскольку стандартные библиотеки для валидации JWT (такие как `jsonwebtoken`) зависят от нативных Node.js модулей, недоступных во встроенной среде Edge Middleware, была спроектирована гибридная схема проверки: middleware проверяет наличие куки для быстрого редиректа неавторизованных пользователей, а полноценная криптографическая проверка токена выполняется уже на сервере в API-маршрутах.</w:t>
+        <w:t>• Настройка middleware в Next.js для проверки авторизации. Поскольку библиотека `jsonwebtoken` не работает в Edge Middleware, пришлось разобраться, как правильно читать cookies на стороне сервера, чтобы закрыть доступ к доскам для неавторизованных пользователей и выполнять проверку токена уже в API-маршрутах.</w:t>
         <w:br/>
-        <w:t>• Реализация плавного перемещения карточек без использования внешних библиотек (например, react-beautiful-dnd). Были детально изучены события dragstart, dragover и drop. В результате удалось написать чистый, компактный код на 20 строк, что снизило размер бандла приложения и положительно сказалось на оценках Code Climate.</w:t>
+        <w:t>• Реализация перетаскивания карточек. Нужно было правильно обрабатывать события dragstart, dragover и drop, чтобы карточки перемещались между колонками без багов. Написание собственной логики перетаскивания позволило не использовать тяжелые библиотеки.</w:t>
       </w:r>
     </w:p>
     <w:p>

</xml_diff>